<commit_message>
se agrega opcion de seleccion de carta en cartas de notificacion de Gestion Humana
</commit_message>
<xml_diff>
--- a/docs/informes/informe-gerencial-statflow-2026-10.docx
+++ b/docs/informes/informe-gerencial-statflow-2026-10.docx
@@ -2700,7 +2700,7 @@
       </w:r>
       <w:r>
         <w:rPr/>
-        <w:t xml:space="preserve"> la suite completa de pruebas no se ejecutó en esta ventana por tiempo de ejecución; el conteo de pruebas es estático.</w:t>
+        <w:t xml:space="preserve"> la suite completa de pruebas no tiene baseline de ejecución al cierre. El intento con el límite por defecto (300 s) se abortó por max_execution_time; el conteo de pruebas es estático. El baseline debe generarse con php -d max_execution_time=0 artisan test --compact.</w:t>
       </w:r>
     </w:p>
     <w:p>
@@ -2768,7 +2768,7 @@
 <file path=word/numbering.xml><?xml version="1.0" encoding="utf-8"?>
 <w:numbering xmlns:ve="http://schemas.openxmlformats.org/markup-compatibility/2006" xmlns:o="urn:schemas-microsoft-com:office:office" xmlns:r="http://schemas.openxmlformats.org/officeDocument/2006/relationships" xmlns:m="http://schemas.openxmlformats.org/officeDocument/2006/math" xmlns:v="urn:schemas-microsoft-com:vml" xmlns:wp="http://schemas.openxmlformats.org/drawingml/2006/wordprocessingDrawing" xmlns:w10="urn:schemas-microsoft-com:office:word" xmlns:w="http://schemas.openxmlformats.org/wordprocessingml/2006/main" xmlns:wne="http://schemas.microsoft.com/office/word/2006/wordml">
   <w:abstractNum w:abstractNumId="4">
-    <w:nsid w:val="2E3456ED"/>
+    <w:nsid w:val="A14E5C48"/>
     <w:multiLevelType w:val="hybridMultilevel"/>
     <w:lvl w:ilvl="0">
       <w:start w:val="1"/>
@@ -2916,7 +2916,7 @@
     </w:lvl>
   </w:abstractNum>
   <w:abstractNum w:abstractNumId="5">
-    <w:nsid w:val="3D27ACCB"/>
+    <w:nsid w:val="E8829722"/>
     <w:multiLevelType w:val="hybridMultilevel"/>
     <w:lvl w:ilvl="0">
       <w:start w:val="1"/>

</xml_diff>

<commit_message>
se ajusta carga masiva para que cargue las ciudades sin validarlas en catalogo de requisiciones
</commit_message>
<xml_diff>
--- a/docs/informes/informe-gerencial-statflow-2026-10.docx
+++ b/docs/informes/informe-gerencial-statflow-2026-10.docx
@@ -2700,7 +2700,7 @@
       </w:r>
       <w:r>
         <w:rPr/>
-        <w:t xml:space="preserve"> la suite completa de pruebas no tiene baseline de ejecución al cierre. El intento con el límite por defecto (300 s) se abortó por max_execution_time; el conteo de pruebas es estático. El baseline debe generarse con php -d max_execution_time=0 artisan test --compact.</w:t>
+        <w:t xml:space="preserve"> la suite completa de pruebas no tiene baseline de ejecución al cierre. artisan test se aborta a los 300 s por max_execution_time y el flag -d no se propaga al subproceso de PHPUnit; el conteo de pruebas es estático. El baseline debe generarse con php -d max_execution_time=0 vendor/bin/phpunit.</w:t>
       </w:r>
     </w:p>
     <w:p>
@@ -2768,7 +2768,7 @@
 <file path=word/numbering.xml><?xml version="1.0" encoding="utf-8"?>
 <w:numbering xmlns:ve="http://schemas.openxmlformats.org/markup-compatibility/2006" xmlns:o="urn:schemas-microsoft-com:office:office" xmlns:r="http://schemas.openxmlformats.org/officeDocument/2006/relationships" xmlns:m="http://schemas.openxmlformats.org/officeDocument/2006/math" xmlns:v="urn:schemas-microsoft-com:vml" xmlns:wp="http://schemas.openxmlformats.org/drawingml/2006/wordprocessingDrawing" xmlns:w10="urn:schemas-microsoft-com:office:word" xmlns:w="http://schemas.openxmlformats.org/wordprocessingml/2006/main" xmlns:wne="http://schemas.microsoft.com/office/word/2006/wordml">
   <w:abstractNum w:abstractNumId="4">
-    <w:nsid w:val="A14E5C48"/>
+    <w:nsid w:val="6C917DD9"/>
     <w:multiLevelType w:val="hybridMultilevel"/>
     <w:lvl w:ilvl="0">
       <w:start w:val="1"/>
@@ -2916,7 +2916,7 @@
     </w:lvl>
   </w:abstractNum>
   <w:abstractNum w:abstractNumId="5">
-    <w:nsid w:val="E8829722"/>
+    <w:nsid w:val="EFE14D88"/>
     <w:multiLevelType w:val="hybridMultilevel"/>
     <w:lvl w:ilvl="0">
       <w:start w:val="1"/>

</xml_diff>